<commit_message>
Deploy Piper Vietnamese TTS on Render
</commit_message>
<xml_diff>
--- a/deliverables/FlatMate-Comfort-NT532-Technical-Report-formatted.docx
+++ b/deliverables/FlatMate-Comfort-NT532-Technical-Report-formatted.docx
@@ -462,103 +462,63 @@
         <w:pStyle w:val="BodyText"/>
       </w:pPr>
       <w:r>
-        <w:t xml:space="preserve">Backend được xây dựng bằng FastAPI, Pydantic và SQLite. Simulation engine chạy xác định với seed cố định, duy trì lịch sử 24 giờ và phát trạng thái qua Server-Sent Events (SSE). Frontend Next.js sử dụng React Three Fiber để dựng căn hộ, nội thất, người dùng, sensor overlay, dashboard và conversation history. Speech có hai mode: localhost dùng faster-whisper</w:t>
-      </w:r>
-      <w:r>
-        <w:t xml:space="preserve"> </w:t>
-      </w:r>
-      <w:r>
-        <w:rPr>
-          <w:rStyle w:val="VerbatimChar"/>
-        </w:rPr>
-        <w:t xml:space="preserve">small</w:t>
-      </w:r>
-      <w:r>
-        <w:t xml:space="preserve"> </w:t>
-      </w:r>
-      <w:r>
-        <w:t xml:space="preserve">trên CPU</w:t>
-      </w:r>
-      <w:r>
-        <w:t xml:space="preserve"> </w:t>
-      </w:r>
-      <w:r>
-        <w:rPr>
-          <w:rStyle w:val="VerbatimChar"/>
-        </w:rPr>
-        <w:t xml:space="preserve">int8</w:t>
-      </w:r>
-      <w:r>
-        <w:t xml:space="preserve">, VieNeu-TTS v3 Turbo ONNX</w:t>
-      </w:r>
-      <w:r>
-        <w:t xml:space="preserve"> </w:t>
-      </w:r>
-      <w:r>
-        <w:rPr>
-          <w:rStyle w:val="VerbatimChar"/>
-        </w:rPr>
-        <w:t xml:space="preserve">int8</w:t>
-      </w:r>
-      <w:r>
-        <w:t xml:space="preserve"> </w:t>
-      </w:r>
-      <w:r>
-        <w:t xml:space="preserve">và Supertonic fallback; bản Render Free dùng</w:t>
-      </w:r>
-      <w:r>
-        <w:t xml:space="preserve"> </w:t>
-      </w:r>
-      <w:r>
-        <w:rPr>
-          <w:rStyle w:val="VerbatimChar"/>
-        </w:rPr>
-        <w:t xml:space="preserve">SpeechRecognition</w:t>
-      </w:r>
-      <w:r>
-        <w:t xml:space="preserve"> </w:t>
-      </w:r>
-      <w:r>
-        <w:t xml:space="preserve">cùng</w:t>
-      </w:r>
-      <w:r>
-        <w:t xml:space="preserve"> </w:t>
-      </w:r>
-      <w:r>
-        <w:rPr>
-          <w:rStyle w:val="VerbatimChar"/>
-        </w:rPr>
-        <w:t xml:space="preserve">speechSynthesis</w:t>
-      </w:r>
-      <w:r>
-        <w:t xml:space="preserve"> </w:t>
-      </w:r>
-      <w:r>
-        <w:t xml:space="preserve">của trình duyệt để không cài model speech trên máy chủ.</w:t>
-      </w:r>
+        <w:t>Backend được xây dựng bằng FastAPI, Pydantic và SQLite. Simulation engine chạy xác định với seed cố định, duy trì lịch sử 24 giờ và phát trạng thái qua Server-Sent Events (SSE). Frontend Next.js sử dụng React Three Fiber để dựng căn hộ, nội thất, người dùng, sensor overlay, dashboard và conversation history. Speech có hai mode: localhost dùng faster-whisper small trên CPU int8, VieNeu-TTS v3 Turbo ONNX int8 và Supertonic fallback; bản Render Free dùng SpeechRecognition cho ASR và Piper vi_VN-vais1000-medium trên backend cho TTS.</w:t>
+      </w:r>
+      <w:r/>
+      <w:r>
+        <w:rPr>
+          <w:rStyle w:val="VerbatimChar"/>
+        </w:rPr>
+      </w:r>
+      <w:r/>
+      <w:r/>
+      <w:r/>
+      <w:r>
+        <w:rPr>
+          <w:rStyle w:val="VerbatimChar"/>
+        </w:rPr>
+      </w:r>
+      <w:r/>
+      <w:r/>
+      <w:r>
+        <w:rPr>
+          <w:rStyle w:val="VerbatimChar"/>
+        </w:rPr>
+      </w:r>
+      <w:r/>
+      <w:r/>
+      <w:r/>
+      <w:r>
+        <w:rPr>
+          <w:rStyle w:val="VerbatimChar"/>
+        </w:rPr>
+      </w:r>
+      <w:r/>
+      <w:r/>
+      <w:r/>
+      <w:r>
+        <w:rPr>
+          <w:rStyle w:val="VerbatimChar"/>
+        </w:rPr>
+      </w:r>
+      <w:r/>
+      <w:r/>
     </w:p>
     <w:p>
       <w:pPr>
         <w:pStyle w:val="BodyText"/>
       </w:pPr>
       <w:r>
-        <w:t xml:space="preserve">Kết quả kiểm tra tại thời điểm báo cáo gồm 46 test backend đạt, 1 test bỏ qua theo điều kiện môi trường, Ruff đạt, TypeScript đạt và production build thành công. Dataset baseline có 1.440 mẫu cảm biến, tương ứng một mẫu mỗi phút trong 24 giờ. Một lần chạy end-to-end trên kịch bản</w:t>
-      </w:r>
-      <w:r>
-        <w:t xml:space="preserve"> </w:t>
-      </w:r>
-      <w:r>
-        <w:rPr>
-          <w:rStyle w:val="VerbatimChar"/>
-        </w:rPr>
-        <w:t xml:space="preserve">hot_room</w:t>
-      </w:r>
-      <w:r>
-        <w:t xml:space="preserve"> </w:t>
-      </w:r>
-      <w:r>
-        <w:t xml:space="preserve">đã chuyển trạng thái từ AC tắt ở 27°C và quạt tắt sang AC bật ở 25°C, quạt mức 1; cửa sổ giữ đóng. TTS local greedy tạo câu 2,80 giây với thời gian trung bình 2,99 giây qua ba lượt và cho cùng transcript khi kiểm tra vòng bằng ASR.</w:t>
-      </w:r>
+        <w:t>Kết quả kiểm tra tại thời điểm báo cáo gồm 51 test backend đạt, 1 test bỏ qua theo điều kiện môi trường, Ruff đạt, TypeScript đạt, production build và Docker smoke test thành công. Dataset baseline có 1.440 mẫu cảm biến, tương ứng một mẫu mỗi phút trong 24 giờ. Một lần chạy end-to-end trên kịch bản hot_room đã chuyển trạng thái từ AC tắt ở 27°C và quạt tắt sang AC bật ở 25°C, quạt mức 1; cửa sổ giữ đóng. TTS local greedy tạo câu 2,80 giây với thời gian trung bình 2,99 giây; container Piper bị giới hạn đúng 512 MB và 0,1 CPU tạo câu 3,855 giây trong 17,12 giây ở lượt lazy-load đầu, 1,49 giây ở lượt warm và dùng 254,3 MiB RSS cho toàn service.</w:t>
+      </w:r>
+      <w:r/>
+      <w:r>
+        <w:rPr>
+          <w:rStyle w:val="VerbatimChar"/>
+        </w:rPr>
+      </w:r>
+      <w:r/>
+      <w:r/>
     </w:p>
     <w:p>
       <w:pPr>
@@ -1389,7 +1349,7 @@
         </w:numPr>
       </w:pPr>
       <w:r>
-        <w:t xml:space="preserve">Hỗ trợ push-to-talk và TTS tiếng Việt bằng local model hoặc Web Speech API theo môi trường.</w:t>
+        <w:t>Hỗ trợ push-to-talk và TTS tiếng Việt bằng local model hoặc Piper backend theo môi trường.</w:t>
       </w:r>
     </w:p>
     <w:p>
@@ -2671,38 +2631,24 @@
         <w:pStyle w:val="BodyText"/>
       </w:pPr>
       <w:r>
-        <w:t xml:space="preserve">Hình 1 mô tả local mode đầy đủ. Trên Render Free, hai khối ASR/TTS offline được thay bằng</w:t>
-      </w:r>
-      <w:r>
-        <w:t xml:space="preserve"> </w:t>
-      </w:r>
-      <w:r>
-        <w:rPr>
-          <w:rStyle w:val="VerbatimChar"/>
-        </w:rPr>
-        <w:t xml:space="preserve">SpeechRecognition</w:t>
-      </w:r>
-      <w:r>
-        <w:t xml:space="preserve"> </w:t>
-      </w:r>
-      <w:r>
-        <w:t xml:space="preserve">và</w:t>
-      </w:r>
-      <w:r>
-        <w:t xml:space="preserve"> </w:t>
-      </w:r>
-      <w:r>
-        <w:rPr>
-          <w:rStyle w:val="VerbatimChar"/>
-        </w:rPr>
-        <w:t xml:space="preserve">speechSynthesis</w:t>
-      </w:r>
-      <w:r>
-        <w:t xml:space="preserve"> </w:t>
-      </w:r>
-      <w:r>
-        <w:t xml:space="preserve">trong trình duyệt.</w:t>
-      </w:r>
+        <w:t>Hình 1 mô tả local mode đầy đủ. Trên Render Free, ASR offline được thay bằng SpeechRecognition; TTS dùng Piper medium qua cùng endpoint /api/tts.</w:t>
+      </w:r>
+      <w:r/>
+      <w:r>
+        <w:rPr>
+          <w:rStyle w:val="VerbatimChar"/>
+        </w:rPr>
+      </w:r>
+      <w:r/>
+      <w:r/>
+      <w:r/>
+      <w:r>
+        <w:rPr>
+          <w:rStyle w:val="VerbatimChar"/>
+        </w:rPr>
+      </w:r>
+      <w:r/>
+      <w:r/>
     </w:p>
     <w:bookmarkStart w:id="36" w:name="lớp-tương-tác"/>
     <w:p>
@@ -3103,47 +3049,30 @@
         <w:pStyle w:val="FirstParagraph"/>
       </w:pPr>
       <w:r>
-        <w:t xml:space="preserve">Simulation và SQLite chạy trong FastAPI. Localhost còn chạy ASR/TTS cục bộ; Render Free đặt</w:t>
-      </w:r>
-      <w:r>
-        <w:t xml:space="preserve"> </w:t>
-      </w:r>
-      <w:r>
-        <w:rPr>
-          <w:rStyle w:val="VerbatimChar"/>
-        </w:rPr>
-        <w:t xml:space="preserve">LOCAL_SPEECH_ENABLED=false</w:t>
-      </w:r>
-      <w:r>
-        <w:t xml:space="preserve">, bỏ optional dependency</w:t>
-      </w:r>
-      <w:r>
-        <w:t xml:space="preserve"> </w:t>
-      </w:r>
-      <w:r>
-        <w:rPr>
-          <w:rStyle w:val="VerbatimChar"/>
-        </w:rPr>
-        <w:t xml:space="preserve">speech</w:t>
-      </w:r>
-      <w:r>
-        <w:t xml:space="preserve">, và chuyển voice sang trình duyệt. LLM là dependency bên ngoài khi</w:t>
-      </w:r>
-      <w:r>
-        <w:t xml:space="preserve"> </w:t>
-      </w:r>
-      <w:r>
-        <w:rPr>
-          <w:rStyle w:val="VerbatimChar"/>
-        </w:rPr>
-        <w:t xml:space="preserve">OPENAI_API_KEY</w:t>
-      </w:r>
-      <w:r>
-        <w:t xml:space="preserve"> </w:t>
-      </w:r>
-      <w:r>
-        <w:t xml:space="preserve">được cấu hình. Audio gốc không đi qua assistant API; backend chỉ gửi text, trạng thái cần thiết và tool output. SQLite trên Render Free dùng filesystem tạm thời nên không bảo đảm giữ history hoặc preference qua deploy/restart.</w:t>
-      </w:r>
+        <w:t>Simulation và SQLite chạy trong FastAPI. Localhost chạy ASR/TTS cục bộ; Render Free đặt LOCAL_ASR_ENABLED=false, cài riêng optional dependency piper, nhận transcript qua browser và tạo WAV trên backend. LLM là dependency bên ngoài khi OPENAI_API_KEY được cấu hình. Audio gốc từ microphone không đi qua assistant API trên Render; backend chỉ nhận transcript, gửi text, trạng thái cần thiết và tool output. SQLite trên Render Free dùng filesystem tạm thời nên không bảo đảm giữ history hoặc preference qua deploy/restart.</w:t>
+      </w:r>
+      <w:r/>
+      <w:r>
+        <w:rPr>
+          <w:rStyle w:val="VerbatimChar"/>
+        </w:rPr>
+      </w:r>
+      <w:r/>
+      <w:r/>
+      <w:r>
+        <w:rPr>
+          <w:rStyle w:val="VerbatimChar"/>
+        </w:rPr>
+      </w:r>
+      <w:r/>
+      <w:r/>
+      <w:r>
+        <w:rPr>
+          <w:rStyle w:val="VerbatimChar"/>
+        </w:rPr>
+      </w:r>
+      <w:r/>
+      <w:r/>
     </w:p>
     <w:bookmarkEnd w:id="40"/>
     <w:bookmarkEnd w:id="41"/>
@@ -5609,7 +5538,7 @@
         <w:pStyle w:val="FirstParagraph"/>
       </w:pPr>
       <w:r>
-        <w:t xml:space="preserve">Build mode quyết định provider. Localhost mặc định dùng backend offline để có model và vocabulary kiểm soát được. Docker deployment dùng Web Speech API để vừa giới hạn RAM/CPU vừa tránh tải hàng trăm MB model trên Render Free.</w:t>
+        <w:t>Build mode quyết định riêng provider capture và provider TTS. Localhost mặc định dùng backend offline để có model và vocabulary kiểm soát được. Docker deployment dùng browser SpeechRecognition cho ASR và Piper medium trên backend cho TTS; cách tách này bỏ Whisper khỏi image nhưng vẫn bảo đảm giọng Việt không phụ thuộc browser/OS.</w:t>
       </w:r>
     </w:p>
     <w:bookmarkStart w:id="58" w:name="asr"/>
@@ -5974,65 +5903,39 @@
         <w:pStyle w:val="BodyText"/>
       </w:pPr>
       <w:r>
-        <w:t xml:space="preserve">Model assets cần tải ở lần local sử dụng đầu tiên. Sau khi cache hoàn tất, ASR và TTS inference chạy cục bộ. Browser mode không gọi</w:t>
-      </w:r>
-      <w:r>
-        <w:t xml:space="preserve"> </w:t>
-      </w:r>
-      <w:r>
-        <w:rPr>
-          <w:rStyle w:val="VerbatimChar"/>
-        </w:rPr>
-        <w:t xml:space="preserve">/api/asr</w:t>
-      </w:r>
-      <w:r>
-        <w:t xml:space="preserve"> </w:t>
-      </w:r>
-      <w:r>
-        <w:t xml:space="preserve">hoặc</w:t>
-      </w:r>
-      <w:r>
-        <w:t xml:space="preserve"> </w:t>
-      </w:r>
-      <w:r>
-        <w:rPr>
-          <w:rStyle w:val="VerbatimChar"/>
-        </w:rPr>
-        <w:t xml:space="preserve">/api/tts</w:t>
-      </w:r>
-      <w:r>
-        <w:t xml:space="preserve">; frontend tạo</w:t>
-      </w:r>
-      <w:r>
-        <w:t xml:space="preserve"> </w:t>
-      </w:r>
-      <w:r>
-        <w:rPr>
-          <w:rStyle w:val="VerbatimChar"/>
-        </w:rPr>
-        <w:t xml:space="preserve">SpeechSynthesisUtterance</w:t>
-      </w:r>
-      <w:r>
-        <w:t xml:space="preserve"> </w:t>
-      </w:r>
-      <w:r>
-        <w:t xml:space="preserve">với</w:t>
-      </w:r>
-      <w:r>
-        <w:t xml:space="preserve"> </w:t>
-      </w:r>
-      <w:r>
-        <w:rPr>
-          <w:rStyle w:val="VerbatimChar"/>
-        </w:rPr>
-        <w:t xml:space="preserve">lang="vi-VN"</w:t>
-      </w:r>
-      <w:r>
-        <w:t xml:space="preserve"> </w:t>
-      </w:r>
-      <w:r>
-        <w:t xml:space="preserve">và ưu tiên voice Việt có sẵn trên browser/OS.</w:t>
-      </w:r>
+        <w:t>Model VieNeu, Supertonic và faster-whisper cần tải ở lần local sử dụng đầu tiên. Render không gọi /api/asr; frontend dùng SpeechRecognition với lang="vi-VN", nhưng luôn gọi /api/tts để nhận Piper WAV. Browser synthesis chỉ còn là mode fallback tùy chọn.</w:t>
+      </w:r>
+      <w:r/>
+      <w:r>
+        <w:rPr>
+          <w:rStyle w:val="VerbatimChar"/>
+        </w:rPr>
+      </w:r>
+      <w:r/>
+      <w:r/>
+      <w:r/>
+      <w:r>
+        <w:rPr>
+          <w:rStyle w:val="VerbatimChar"/>
+        </w:rPr>
+      </w:r>
+      <w:r/>
+      <w:r/>
+      <w:r>
+        <w:rPr>
+          <w:rStyle w:val="VerbatimChar"/>
+        </w:rPr>
+      </w:r>
+      <w:r/>
+      <w:r/>
+      <w:r/>
+      <w:r>
+        <w:rPr>
+          <w:rStyle w:val="VerbatimChar"/>
+        </w:rPr>
+      </w:r>
+      <w:r/>
+      <w:r/>
     </w:p>
     <w:bookmarkEnd w:id="59"/>
     <w:bookmarkEnd w:id="60"/>
@@ -6553,11 +6456,8 @@
         <w:tc>
           <w:tcPr/>
           <w:p>
-            <w:pPr>
-              <w:pStyle w:val="Compact"/>
-            </w:pPr>
-            <w:r>
-              <w:t xml:space="preserve">Text preparation, VieNeu primary, Supertonic fallback</w:t>
+            <w:r>
+              <w:t>Text preparation, VieNeu/Supertonic local TTS và Piper deployment TTS</w:t>
             </w:r>
           </w:p>
         </w:tc>
@@ -6737,11 +6637,8 @@
         <w:tc>
           <w:tcPr/>
           <w:p>
-            <w:pPr>
-              <w:pStyle w:val="Compact"/>
-            </w:pPr>
-            <w:r>
-              <w:t xml:space="preserve">Chọn local/browser speech, MediaRecorder, Web Speech, TTS playback và wake mode</w:t>
+            <w:r>
+              <w:t>Chọn riêng capture/TTS provider, MediaRecorder, Web Speech, backend WAV và wake mode</w:t>
             </w:r>
           </w:p>
         </w:tc>
@@ -6816,35 +6713,23 @@
         <w:pStyle w:val="FirstParagraph"/>
       </w:pPr>
       <w:r>
-        <w:t xml:space="preserve">API gồm health/state, simulation, scenario, device command, assistant, ASR/TTS, conversation, preference, history và SSE. Unknown fields bị từ chối; audio payload giới hạn 15 MB; history bị clamp ở 24 giờ mới nhất. ASR/TTS endpoint trả</w:t>
-      </w:r>
-      <w:r>
-        <w:t xml:space="preserve"> </w:t>
-      </w:r>
-      <w:r>
-        <w:rPr>
-          <w:rStyle w:val="VerbatimChar"/>
-        </w:rPr>
-        <w:t xml:space="preserve">503</w:t>
-      </w:r>
-      <w:r>
-        <w:t xml:space="preserve"> </w:t>
-      </w:r>
-      <w:r>
-        <w:t xml:space="preserve">khi</w:t>
-      </w:r>
-      <w:r>
-        <w:t xml:space="preserve"> </w:t>
-      </w:r>
-      <w:r>
-        <w:rPr>
-          <w:rStyle w:val="VerbatimChar"/>
-        </w:rPr>
-        <w:t xml:space="preserve">LOCAL_SPEECH_ENABLED=false</w:t>
-      </w:r>
-      <w:r>
-        <w:t xml:space="preserve">.</w:t>
-      </w:r>
+        <w:t>API gồm health/state, simulation, scenario, device command, assistant, ASR/TTS, conversation, preference, history và SSE. Unknown fields bị từ chối; audio payload giới hạn 15 MB; history bị clamp ở 24 giờ mới nhất. LOCAL_ASR_ENABLED có thể tắt ASR độc lập; TTS trả 503 khi engine/model không khả dụng và 422 khi vượt giới hạn runtime.</w:t>
+      </w:r>
+      <w:r/>
+      <w:r>
+        <w:rPr>
+          <w:rStyle w:val="VerbatimChar"/>
+        </w:rPr>
+      </w:r>
+      <w:r/>
+      <w:r/>
+      <w:r/>
+      <w:r>
+        <w:rPr>
+          <w:rStyle w:val="VerbatimChar"/>
+        </w:rPr>
+      </w:r>
+      <w:r/>
     </w:p>
     <w:bookmarkEnd w:id="64"/>
     <w:bookmarkEnd w:id="65"/>
@@ -7731,6 +7616,12 @@
     <w:bookmarkEnd w:id="68"/>
     <w:bookmarkStart w:id="69" w:name="kiểm-thử"/>
     <w:p>
+      <w:pPr/>
+      <w:r>
+        <w:t>Docker smoke test cấu hình Render Piper medium bị giới hạn bằng 512 MB và 0,1 CPU: model 63,2 MB; full-service RSS 254,3 MiB; request lazy-load đầu 17,12 giây; request warm 1,49 giây; đầu ra 3,855 giây WAV mono PCM 16-bit 22,05 kHz; không OOM. Header: X-TTS-Engine piper-1.6.0-onnx-cpu; X-TTS-Voice vi_VN-vais1000-medium.</w:t>
+      </w:r>
+    </w:p>
+    <w:p>
       <w:pPr>
         <w:pStyle w:val="Heading3"/>
       </w:pPr>
@@ -7791,11 +7682,8 @@
         <w:tc>
           <w:tcPr/>
           <w:p>
-            <w:pPr>
-              <w:pStyle w:val="Compact"/>
-            </w:pPr>
-            <w:r>
-              <w:t xml:space="preserve">46 passed, 1 skipped</w:t>
+            <w:r>
+              <w:t>51 passed, 1 skipped</w:t>
             </w:r>
           </w:p>
         </w:tc>
@@ -7935,7 +7823,7 @@
         <w:pStyle w:val="BodyText"/>
       </w:pPr>
       <w:r>
-        <w:t xml:space="preserve">Test bao phủ contract, scenario loading, deterministic reset, history clamp, atomic command, assistant tool loop, preference lifecycle, session isolation, implicit candidate gating và promotion sau ba manual override, TTS text normalization, fallback, VieNeu initialization failure cache và trạng thái local speech bị tắt trong deployment.</w:t>
+        <w:t>Test bao phủ contract, scenario loading, deterministic reset, history clamp, atomic command, assistant tool loop, preference lifecycle, session isolation, implicit candidate gating và promotion sau ba manual override, TTS text normalization, fallback, VieNeu/Piper initialization failure cache, Piper WAV contract và giới hạn text runtime.</w:t>
       </w:r>
     </w:p>
     <w:bookmarkEnd w:id="69"/>
@@ -8271,7 +8159,7 @@
         </w:numPr>
       </w:pPr>
       <w:r>
-        <w:t xml:space="preserve">Speech pipeline Việt ngữ giữ local offline mode nhưng có browser mode đủ nhẹ cho Render Free.</w:t>
+        <w:t>Speech pipeline Việt ngữ giữ local offline mode; Render dùng browser ASR và Piper backend đủ nhẹ cho Free tier.</w:t>
       </w:r>
     </w:p>
     <w:p>
@@ -8588,103 +8476,101 @@
         <w:rPr>
           <w:rStyle w:val="VerbatimChar"/>
         </w:rPr>
-        <w:t xml:space="preserve">LOCAL_SPEECH_ENABLED=true</w:t>
-      </w:r>
-      <w:r>
+        <w:t>TTS_ENABLED=true</w:t>
         <w:br/>
-      </w:r>
-      <w:r>
-        <w:rPr>
-          <w:rStyle w:val="VerbatimChar"/>
-        </w:rPr>
-        <w:t xml:space="preserve">NEXT_PUBLIC_SPEECH_MODE=local</w:t>
-      </w:r>
-      <w:r>
+        <w:t>LOCAL_ASR_ENABLED=true</w:t>
         <w:br/>
-      </w:r>
-      <w:r>
+        <w:t>NEXT_PUBLIC_SPEECH_MODE=local</w:t>
         <w:br/>
-      </w:r>
-      <w:r>
-        <w:rPr>
-          <w:rStyle w:val="VerbatimChar"/>
-        </w:rPr>
-        <w:t xml:space="preserve">ASR_MODEL=small</w:t>
-      </w:r>
-      <w:r>
+        <w:t>NEXT_PUBLIC_TTS_MODE=backend</w:t>
         <w:br/>
-      </w:r>
-      <w:r>
-        <w:rPr>
-          <w:rStyle w:val="VerbatimChar"/>
-        </w:rPr>
-        <w:t xml:space="preserve">ASR_DEVICE=cpu</w:t>
-      </w:r>
-      <w:r>
         <w:br/>
-      </w:r>
-      <w:r>
-        <w:rPr>
-          <w:rStyle w:val="VerbatimChar"/>
-        </w:rPr>
-        <w:t xml:space="preserve">ASR_COMPUTE_TYPE=int8</w:t>
-      </w:r>
-      <w:r>
+        <w:t>ASR_MODEL=small</w:t>
         <w:br/>
-      </w:r>
-      <w:r>
-        <w:rPr>
-          <w:rStyle w:val="VerbatimChar"/>
-        </w:rPr>
-        <w:t xml:space="preserve">ASR_BEAM_SIZE=2</w:t>
-      </w:r>
-      <w:r>
+        <w:t>ASR_DEVICE=cpu</w:t>
         <w:br/>
-      </w:r>
-      <w:r>
+        <w:t>ASR_COMPUTE_TYPE=int8</w:t>
         <w:br/>
-      </w:r>
-      <w:r>
-        <w:rPr>
-          <w:rStyle w:val="VerbatimChar"/>
-        </w:rPr>
-        <w:t xml:space="preserve">TTS_ENGINE=vieneu</w:t>
-      </w:r>
-      <w:r>
+        <w:t>ASR_BEAM_SIZE=2</w:t>
         <w:br/>
-      </w:r>
-      <w:r>
-        <w:rPr>
-          <w:rStyle w:val="VerbatimChar"/>
-        </w:rPr>
-        <w:t xml:space="preserve">VIENEU_VOICE=Mai Anh</w:t>
-      </w:r>
-      <w:r>
         <w:br/>
-      </w:r>
-      <w:r>
-        <w:rPr>
-          <w:rStyle w:val="VerbatimChar"/>
-        </w:rPr>
-        <w:t xml:space="preserve">SUPERTONIC_VOICE=F4</w:t>
-      </w:r>
-      <w:r>
+        <w:t>TTS_ENGINE=vieneu</w:t>
         <w:br/>
-      </w:r>
-      <w:r>
-        <w:rPr>
-          <w:rStyle w:val="VerbatimChar"/>
-        </w:rPr>
-        <w:t xml:space="preserve">SUPERTONIC_STEPS=12</w:t>
-      </w:r>
-      <w:r>
+        <w:t>TTS_MAX_CHARACTERS=2000</w:t>
         <w:br/>
-      </w:r>
-      <w:r>
-        <w:rPr>
-          <w:rStyle w:val="VerbatimChar"/>
-        </w:rPr>
-        <w:t xml:space="preserve">SUPERTONIC_SPEED=1.0</w:t>
+        <w:t>VIENEU_VOICE=Mai Anh</w:t>
+        <w:br/>
+        <w:t>SUPERTONIC_VOICE=F4</w:t>
+        <w:br/>
+        <w:t>SUPERTONIC_STEPS=12</w:t>
+        <w:br/>
+        <w:t>SUPERTONIC_SPEED=1.0</w:t>
+        <w:br/>
+        <w:t>PIPER_MODEL_PATH=./models/vi_VN-vais1000-medium.onnx</w:t>
+        <w:br/>
+        <w:t>PIPER_VOICE=vi_VN-vais1000-medium</w:t>
+      </w:r>
+      <w:r/>
+      <w:r>
+        <w:rPr>
+          <w:rStyle w:val="VerbatimChar"/>
+        </w:rPr>
+      </w:r>
+      <w:r/>
+      <w:r/>
+      <w:r>
+        <w:rPr>
+          <w:rStyle w:val="VerbatimChar"/>
+        </w:rPr>
+      </w:r>
+      <w:r/>
+      <w:r>
+        <w:rPr>
+          <w:rStyle w:val="VerbatimChar"/>
+        </w:rPr>
+      </w:r>
+      <w:r/>
+      <w:r>
+        <w:rPr>
+          <w:rStyle w:val="VerbatimChar"/>
+        </w:rPr>
+      </w:r>
+      <w:r/>
+      <w:r>
+        <w:rPr>
+          <w:rStyle w:val="VerbatimChar"/>
+        </w:rPr>
+      </w:r>
+      <w:r/>
+      <w:r/>
+      <w:r>
+        <w:rPr>
+          <w:rStyle w:val="VerbatimChar"/>
+        </w:rPr>
+      </w:r>
+      <w:r/>
+      <w:r>
+        <w:rPr>
+          <w:rStyle w:val="VerbatimChar"/>
+        </w:rPr>
+      </w:r>
+      <w:r/>
+      <w:r>
+        <w:rPr>
+          <w:rStyle w:val="VerbatimChar"/>
+        </w:rPr>
+      </w:r>
+      <w:r/>
+      <w:r>
+        <w:rPr>
+          <w:rStyle w:val="VerbatimChar"/>
+        </w:rPr>
+      </w:r>
+      <w:r/>
+      <w:r>
+        <w:rPr>
+          <w:rStyle w:val="VerbatimChar"/>
+        </w:rPr>
       </w:r>
     </w:p>
     <w:bookmarkEnd w:id="76"/>
@@ -8702,95 +8588,58 @@
         <w:pStyle w:val="FirstParagraph"/>
       </w:pPr>
       <w:r>
-        <w:t xml:space="preserve">Docker build frontend với</w:t>
-      </w:r>
-      <w:r>
-        <w:t xml:space="preserve"> </w:t>
-      </w:r>
-      <w:r>
-        <w:rPr>
-          <w:rStyle w:val="VerbatimChar"/>
-        </w:rPr>
-        <w:t xml:space="preserve">NEXT_PUBLIC_SPEECH_MODE=browser</w:t>
-      </w:r>
-      <w:r>
-        <w:t xml:space="preserve">, cài backend không có extra</w:t>
-      </w:r>
-      <w:r>
-        <w:t xml:space="preserve"> </w:t>
-      </w:r>
-      <w:r>
-        <w:rPr>
-          <w:rStyle w:val="VerbatimChar"/>
-        </w:rPr>
-        <w:t xml:space="preserve">speech</w:t>
-      </w:r>
-      <w:r>
-        <w:t xml:space="preserve">, và đặt</w:t>
-      </w:r>
-      <w:r>
-        <w:t xml:space="preserve"> </w:t>
-      </w:r>
-      <w:r>
-        <w:rPr>
-          <w:rStyle w:val="VerbatimChar"/>
-        </w:rPr>
-        <w:t xml:space="preserve">LOCAL_SPEECH_ENABLED=false</w:t>
-      </w:r>
-      <w:r>
-        <w:t xml:space="preserve">.</w:t>
-      </w:r>
-      <w:r>
-        <w:t xml:space="preserve"> </w:t>
-      </w:r>
-      <w:r>
-        <w:rPr>
-          <w:rStyle w:val="VerbatimChar"/>
-        </w:rPr>
-        <w:t xml:space="preserve">render.yaml</w:t>
-      </w:r>
-      <w:r>
-        <w:t xml:space="preserve"> </w:t>
-      </w:r>
-      <w:r>
-        <w:t xml:space="preserve">dùng gói</w:t>
-      </w:r>
-      <w:r>
-        <w:t xml:space="preserve"> </w:t>
-      </w:r>
-      <w:r>
-        <w:rPr>
-          <w:rStyle w:val="VerbatimChar"/>
-        </w:rPr>
-        <w:t xml:space="preserve">free</w:t>
-      </w:r>
-      <w:r>
-        <w:t xml:space="preserve">; browser Chrome/Edge thực hiện recognition/synthesis trên HTTPS. SQLite đặt tại</w:t>
-      </w:r>
-      <w:r>
-        <w:t xml:space="preserve"> </w:t>
-      </w:r>
-      <w:r>
-        <w:rPr>
-          <w:rStyle w:val="VerbatimChar"/>
-        </w:rPr>
-        <w:t xml:space="preserve">/tmp/flatmate.db</w:t>
-      </w:r>
-      <w:r>
-        <w:t xml:space="preserve">, vì vậy history, conversation và learned preference không bền qua deploy hoặc restart. Khi cần persistence hoặc local speech trên server, phải dùng paid instance cùng persistent disk và cài extra</w:t>
-      </w:r>
-      <w:r>
-        <w:t xml:space="preserve"> </w:t>
-      </w:r>
-      <w:r>
-        <w:rPr>
-          <w:rStyle w:val="VerbatimChar"/>
-        </w:rPr>
-        <w:t xml:space="preserve">speech</w:t>
-      </w:r>
-      <w:r>
-        <w:t xml:space="preserve">.</w:t>
-      </w:r>
+        <w:t>Docker build frontend với NEXT_PUBLIC_SPEECH_MODE=browser và NEXT_PUBLIC_TTS_MODE=backend, cài backend chỉ với extra piper, bật backend TTS và đặt LOCAL_ASR_ENABLED=false. Model vi_VN-vais1000-medium được bundle và kiểm SHA-256. render.yaml dùng gói free; Chrome/Edge thực hiện recognition trên HTTPS, còn FastAPI trả Piper WAV. SQLite đặt tại /tmp/flatmate.db, vì vậy history, conversation và learned preference không bền qua deploy hoặc restart. Khi cần persistence hoặc throughput speech cao hơn, dùng paid instance cùng persistent disk/CPU phù hợp.</w:t>
+      </w:r>
+      <w:r/>
+      <w:r>
+        <w:rPr>
+          <w:rStyle w:val="VerbatimChar"/>
+        </w:rPr>
+      </w:r>
+      <w:r/>
+      <w:r/>
+      <w:r>
+        <w:rPr>
+          <w:rStyle w:val="VerbatimChar"/>
+        </w:rPr>
+      </w:r>
+      <w:r/>
+      <w:r/>
+      <w:r>
+        <w:rPr>
+          <w:rStyle w:val="VerbatimChar"/>
+        </w:rPr>
+      </w:r>
+      <w:r/>
+      <w:r/>
+      <w:r>
+        <w:rPr>
+          <w:rStyle w:val="VerbatimChar"/>
+        </w:rPr>
+      </w:r>
+      <w:r/>
+      <w:r/>
+      <w:r/>
+      <w:r>
+        <w:rPr>
+          <w:rStyle w:val="VerbatimChar"/>
+        </w:rPr>
+      </w:r>
+      <w:r/>
+      <w:r/>
+      <w:r>
+        <w:rPr>
+          <w:rStyle w:val="VerbatimChar"/>
+        </w:rPr>
+      </w:r>
+      <w:r/>
+      <w:r/>
+      <w:r>
+        <w:rPr>
+          <w:rStyle w:val="VerbatimChar"/>
+        </w:rPr>
+      </w:r>
+      <w:r/>
     </w:p>
     <w:bookmarkEnd w:id="77"/>
     <w:bookmarkEnd w:id="78"/>
@@ -8926,7 +8775,7 @@
         <w:pStyle w:val="FirstParagraph"/>
       </w:pPr>
       <w:r>
-        <w:t xml:space="preserve">FlatMate Comfort chứng minh một kiến trúc AIoT cá nhân hóa có thể kiểm chứng trong môi trường không có phần cứng thật. Digital twin tạo ngữ cảnh không gian và trạng thái; simulation engine cung cấp sensor data có thể tái lập; LLM chuyển ngôn ngữ tự nhiên thành structured targets; guardrail giữ quyền kiểm soát miền thiết bị; preference store kết hợp explicit memory, conversational correction và implicit manual override có evidence; local model hoặc Web Speech API cung cấp interaction tiếng Việt theo tài nguyên triển khai.</w:t>
+        <w:t>FlatMate Comfort chứng minh một kiến trúc AIoT cá nhân hóa có thể kiểm chứng trong môi trường không có phần cứng thật. Digital twin tạo ngữ cảnh không gian và trạng thái; simulation engine cung cấp sensor data có thể tái lập; LLM chuyển ngôn ngữ tự nhiên thành structured targets; guardrail giữ quyền kiểm soát miền thiết bị; preference store kết hợp explicit memory, conversational correction và implicit manual override có evidence; local model, browser ASR và Piper backend cung cấp interaction tiếng Việt theo tài nguyên triển khai.</w:t>
       </w:r>
     </w:p>
     <w:p>
@@ -9346,6 +9195,22 @@
     </w:p>
     <w:bookmarkEnd w:id="99"/>
     <w:bookmarkEnd w:id="100"/>
+    <w:p>
+      <w:pPr>
+        <w:pStyle w:val="BodyText"/>
+      </w:pPr>
+      <w:r>
+        <w:t>[16] Open Home Foundation, “Piper — fast local neural text-to-speech.” https://github.com/OHF-Voice/piper1-gpl, https://huggingface.co/rhasspy/piper-voices. Phiên bản runtime 1.6.0, voice vi_VN-vais1000-medium. Truy cập 09/08/2026.</w:t>
+      </w:r>
+    </w:p>
+    <w:p>
+      <w:pPr>
+        <w:pStyle w:val="BodyText"/>
+      </w:pPr>
+      <w:r>
+        <w:t>Piper runtime dùng GPL-3.0. Repository voice dùng MIT; model card ghi dataset VAIS-1000 theo CC BY 4.0. Attribution phân phối kèm tại THIRD_PARTY_NOTICES.md.</w:t>
+      </w:r>
+    </w:p>
     <w:sectPr>
       <w:pgSz w:h="16838" w:w="11906"/>
       <w:pgMar w:bottom="1417" w:footer="708" w:gutter="0" w:header="708" w:left="1587" w:right="1247" w:top="1417"/>

</xml_diff>

<commit_message>
Make assistant context-aware and resilient
</commit_message>
<xml_diff>
--- a/deliverables/FlatMate-Comfort-NT532-Technical-Report-formatted.docx
+++ b/deliverables/FlatMate-Comfort-NT532-Technical-Report-formatted.docx
@@ -509,7 +509,7 @@
         <w:pStyle w:val="BodyText"/>
       </w:pPr>
       <w:r>
-        <w:t>Kết quả kiểm tra tại thời điểm báo cáo gồm 51 test backend đạt, 1 test bỏ qua theo điều kiện môi trường, Ruff đạt, TypeScript đạt, production build và Docker smoke test thành công. Dataset baseline có 1.440 mẫu cảm biến, tương ứng một mẫu mỗi phút trong 24 giờ. Một lần chạy end-to-end trên kịch bản hot_room đã chuyển trạng thái từ AC tắt ở 27°C và quạt tắt sang AC bật ở 25°C, quạt mức 1; cửa sổ giữ đóng. TTS local greedy tạo câu 2,80 giây với thời gian trung bình 2,99 giây; container Piper bị giới hạn đúng 512 MB và 0,1 CPU tạo câu 3,855 giây trong 17,12 giây ở lượt lazy-load đầu, 1,49 giây ở lượt warm và dùng 254,3 MiB RSS cho toàn service.</w:t>
+        <w:t>Kết quả kiểm tra tại thời điểm báo cáo gồm 64 test backend đạt, 1 test bỏ qua theo điều kiện môi trường, Ruff đạt, TypeScript đạt, production build và Docker smoke test thành công. Dataset baseline có 1.440 mẫu cảm biến, tương ứng một mẫu mỗi phút trong 24 giờ. Một lần chạy end-to-end trên kịch bản hot_room đã chuyển trạng thái từ AC tắt ở 27°C và quạt tắt sang AC bật ở 25°C, quạt mức 1; cửa sổ giữ đóng. TTS local greedy tạo câu 2,80 giây với thời gian trung bình 2,99 giây; container Piper bị giới hạn đúng 512 MB và 0,1 CPU tạo câu 3,855 giây trong 17,12 giây ở lượt lazy-load đầu, 1,49 giây ở lượt warm và dùng 254,3 MiB RSS cho toàn service.</w:t>
       </w:r>
       <w:r/>
       <w:r>
@@ -7683,7 +7683,7 @@
           <w:tcPr/>
           <w:p>
             <w:r>
-              <w:t>51 passed, 1 skipped</w:t>
+              <w:t>64 passed, 1 skipped</w:t>
             </w:r>
           </w:p>
         </w:tc>

</xml_diff>

<commit_message>
Harden work and sleep preparation scenes
</commit_message>
<xml_diff>
--- a/deliverables/FlatMate-Comfort-NT532-Technical-Report-formatted.docx
+++ b/deliverables/FlatMate-Comfort-NT532-Technical-Report-formatted.docx
@@ -509,7 +509,7 @@
         <w:pStyle w:val="BodyText"/>
       </w:pPr>
       <w:r>
-        <w:t>Kết quả kiểm tra tại thời điểm báo cáo gồm 64 test backend đạt, 1 test bỏ qua theo điều kiện môi trường, Ruff đạt, TypeScript đạt, production build và Docker smoke test thành công. Dataset baseline có 1.440 mẫu cảm biến, tương ứng một mẫu mỗi phút trong 24 giờ. Một lần chạy end-to-end trên kịch bản hot_room đã chuyển trạng thái từ AC tắt ở 27°C và quạt tắt sang AC bật ở 25°C, quạt mức 1; cửa sổ giữ đóng. TTS local greedy tạo câu 2,80 giây với thời gian trung bình 2,99 giây; container Piper bị giới hạn đúng 512 MB và 0,1 CPU tạo câu 3,855 giây trong 17,12 giây ở lượt lazy-load đầu, 1,49 giây ở lượt warm và dùng 254,3 MiB RSS cho toàn service.</w:t>
+        <w:t>Kết quả kiểm tra tại thời điểm báo cáo gồm 70 test backend đạt, 1 test bỏ qua theo điều kiện môi trường, Ruff đạt, TypeScript đạt, production build và Docker smoke test thành công. Dataset baseline có 1.440 mẫu cảm biến, tương ứng một mẫu mỗi phút trong 24 giờ. Một lần chạy end-to-end trên kịch bản hot_room đã chuyển trạng thái từ AC tắt ở 27°C và quạt tắt sang AC bật ở 25°C, quạt mức 1; cửa sổ giữ đóng. TTS local greedy tạo câu 2,80 giây với thời gian trung bình 2,99 giây; container Piper bị giới hạn đúng 512 MB và 0,1 CPU tạo câu 3,855 giây trong 17,12 giây ở lượt lazy-load đầu, 1,49 giây ở lượt warm và dùng 254,3 MiB RSS cho toàn service.</w:t>
       </w:r>
       <w:r/>
       <w:r>
@@ -7683,7 +7683,7 @@
           <w:tcPr/>
           <w:p>
             <w:r>
-              <w:t>64 passed, 1 skipped</w:t>
+              <w:t>70 passed, 1 skipped</w:t>
             </w:r>
           </w:p>
         </w:tc>

</xml_diff>

<commit_message>
Let LLM write post-commit responses
</commit_message>
<xml_diff>
--- a/deliverables/FlatMate-Comfort-NT532-Technical-Report-formatted.docx
+++ b/deliverables/FlatMate-Comfort-NT532-Technical-Report-formatted.docx
@@ -1,6 +1,6 @@
 
 <file path=word/document.xml><?xml version="1.0" encoding="utf-8"?>
-<w:document xmlns:w="http://schemas.openxmlformats.org/wordprocessingml/2006/main" xmlns:m="http://schemas.openxmlformats.org/officeDocument/2006/math" xmlns:r="http://schemas.openxmlformats.org/officeDocument/2006/relationships" xmlns:o="urn:schemas-microsoft-com:office:office" xmlns:v="urn:schemas-microsoft-com:vml" xmlns:w10="urn:schemas-microsoft-com:office:word" xmlns:a="http://schemas.openxmlformats.org/drawingml/2006/main" xmlns:pic="http://schemas.openxmlformats.org/drawingml/2006/picture" xmlns:wp="http://schemas.openxmlformats.org/drawingml/2006/wordprocessingDrawing">
+<w:document xmlns:ns1="http://schemas.openxmlformats.org/drawingml/2006/wordprocessingDrawing" xmlns:ns2="http://schemas.openxmlformats.org/drawingml/2006/main" xmlns:ns3="http://schemas.openxmlformats.org/drawingml/2006/picture" xmlns:ns4="http://schemas.openxmlformats.org/officeDocument/2006/relationships" xmlns:w="http://schemas.openxmlformats.org/wordprocessingml/2006/main">
   <w:body>
     <w:p>
       <w:pPr>
@@ -2555,44 +2555,44 @@
       </w:pPr>
       <w:r>
         <w:drawing>
-          <wp:inline>
-            <wp:extent cx="5753100" cy="5864566"/>
-            <wp:effectExtent b="0" l="0" r="0" t="0"/>
-            <wp:docPr descr="Hình 1. Kiến trúc tổng thể FlatMate Comfort" title="" id="33" name="Picture"/>
-            <a:graphic>
-              <a:graphicData uri="http://schemas.openxmlformats.org/drawingml/2006/picture">
-                <pic:pic>
-                  <pic:nvPicPr>
-                    <pic:cNvPr descr="docs/figures/flatmate-system-architecture.png" id="34" name="Picture"/>
-                    <pic:cNvPicPr>
-                      <a:picLocks noChangeArrowheads="1" noChangeAspect="1"/>
-                    </pic:cNvPicPr>
-                  </pic:nvPicPr>
-                  <pic:blipFill>
-                    <a:blip r:embed="rId32"/>
-                    <a:stretch>
-                      <a:fillRect/>
-                    </a:stretch>
-                  </pic:blipFill>
-                  <pic:spPr bwMode="auto">
-                    <a:xfrm>
-                      <a:off x="0" y="0"/>
-                      <a:ext cx="5753100" cy="5864566"/>
-                    </a:xfrm>
-                    <a:prstGeom prst="rect">
-                      <a:avLst/>
-                    </a:prstGeom>
-                    <a:noFill/>
-                    <a:ln w="9525">
-                      <a:noFill/>
-                      <a:headEnd/>
-                      <a:tailEnd/>
-                    </a:ln>
-                  </pic:spPr>
-                </pic:pic>
-              </a:graphicData>
-            </a:graphic>
-          </wp:inline>
+          <ns1:inline>
+            <ns1:extent cx="5753100" cy="5864566"/>
+            <ns1:effectExtent b="0" l="0" r="0" t="0"/>
+            <ns1:docPr descr="Hình 1. Kiến trúc tổng thể FlatMate Comfort" title="" id="33" name="Picture"/>
+            <ns2:graphic>
+              <ns2:graphicData uri="http://schemas.openxmlformats.org/drawingml/2006/picture">
+                <ns3:pic>
+                  <ns3:nvPicPr>
+                    <ns3:cNvPr descr="docs/figures/flatmate-system-architecture.png" id="34" name="Picture"/>
+                    <ns3:cNvPicPr>
+                      <ns2:picLocks noChangeArrowheads="1" noChangeAspect="1"/>
+                    </ns3:cNvPicPr>
+                  </ns3:nvPicPr>
+                  <ns3:blipFill>
+                    <ns2:blip ns4:embed="rId32"/>
+                    <ns2:stretch>
+                      <ns2:fillRect/>
+                    </ns2:stretch>
+                  </ns3:blipFill>
+                  <ns3:spPr bwMode="auto">
+                    <ns2:xfrm>
+                      <ns2:off x="0" y="0"/>
+                      <ns2:ext cx="5753100" cy="5864566"/>
+                    </ns2:xfrm>
+                    <ns2:prstGeom prst="rect">
+                      <ns2:avLst/>
+                    </ns2:prstGeom>
+                    <ns2:noFill/>
+                    <ns2:ln w="9525">
+                      <ns2:noFill/>
+                      <ns2:headEnd/>
+                      <ns2:tailEnd/>
+                    </ns2:ln>
+                  </ns3:spPr>
+                </ns3:pic>
+              </ns2:graphicData>
+            </ns2:graphic>
+          </ns1:inline>
         </w:drawing>
       </w:r>
     </w:p>
@@ -2614,7 +2614,7 @@
       <w:r>
         <w:t xml:space="preserve"> </w:t>
       </w:r>
-      <w:hyperlink r:id="rId35">
+      <w:hyperlink ns4:id="rId35">
         <w:r>
           <w:rPr>
             <w:rStyle w:val="VerbatimChar"/>
@@ -4314,22 +4314,7 @@
         <w:pStyle w:val="BodyText"/>
       </w:pPr>
       <w:r>
-        <w:t xml:space="preserve">Assistant không trực tiếp sửa object Python.</w:t>
-      </w:r>
-      <w:r>
-        <w:t xml:space="preserve"> </w:t>
-      </w:r>
-      <w:r>
-        <w:rPr>
-          <w:rStyle w:val="VerbatimChar"/>
-        </w:rPr>
-        <w:t xml:space="preserve">set_room_scene</w:t>
-      </w:r>
-      <w:r>
-        <w:t xml:space="preserve"> </w:t>
-      </w:r>
-      <w:r>
-        <w:t xml:space="preserve">chỉ tạo pending scene. State được cập nhật sau khi final response hợp lệ và scene vượt qua preview validation.</w:t>
+        <w:t xml:space="preserve">Assistant không trực tiếp sửa object Python. set_room_scene chỉ tạo pending scene để backend preview, validate và commit nguyên tử. Sau commit, một lượt LLM không có tool nhận yêu cầu gốc, ChangedValue thật, snapshot mới, context và trạng thái preference để viết toàn bộ phản hồi cuối; câu xác nhận tất định chỉ dùng khi API lỗi hoặc trả rỗng.</w:t>
       </w:r>
     </w:p>
     <w:p>
@@ -4818,6 +4803,15 @@
           <w:rStyle w:val="VerbatimChar"/>
         </w:rPr>
         <w:t xml:space="preserve">→ state_updated</w:t>
+      </w:r>
+      <w:r>
+        <w:br/>
+      </w:r>
+      <w:r>
+        <w:rPr>
+          <w:rStyle w:val="VerbatimChar"/>
+        </w:rPr>
+        <w:t xml:space="preserve">→ model_requested (post-commit, không có tool)</w:t>
       </w:r>
       <w:r>
         <w:br/>
@@ -7823,7 +7817,7 @@
         <w:pStyle w:val="BodyText"/>
       </w:pPr>
       <w:r>
-        <w:t>Test bao phủ contract, scenario loading, deterministic reset, history clamp, atomic command, assistant tool loop, preference lifecycle, session isolation, implicit candidate gating và promotion sau ba manual override, TTS text normalization, fallback, VieNeu/Piper initialization failure cache, Piper WAV contract và giới hạn text runtime.</w:t>
+        <w:t xml:space="preserve">Test bao phủ contract, scenario loading, deterministic reset, history clamp, atomic command, assistant tool loop, post-commit LLM response không có tool, payload dùng ChangedValue và snapshot đã commit, fallback khi lượt sinh lời cuối lỗi, năm context và chuyển context, explicit-value enforcement, màu đèn tiếng Việt, work/sleep preparation, CO₂ ventilation, user negation, no-op confirmation, trạng thái failed sau scene bị bỏ dở, preference isolation, correction áp dụng ngay, implicit candidate gating và promotion brightness/color sau ba manual override, TTS text normalization, VieNeu/Piper initialization failure cache, Piper WAV contract và giới hạn text runtime.</w:t>
       </w:r>
     </w:p>
     <w:bookmarkEnd w:id="69"/>
@@ -8819,7 +8813,7 @@
       <w:r>
         <w:t xml:space="preserve"> </w:t>
       </w:r>
-      <w:hyperlink r:id="rId81">
+      <w:hyperlink ns4:id="rId81">
         <w:r>
           <w:rPr>
             <w:rStyle w:val="VerbatimChar"/>
@@ -8841,7 +8835,7 @@
       <w:r>
         <w:t xml:space="preserve"> </w:t>
       </w:r>
-      <w:hyperlink r:id="rId82">
+      <w:hyperlink ns4:id="rId82">
         <w:r>
           <w:rPr>
             <w:rStyle w:val="Hyperlink"/>
@@ -8855,7 +8849,7 @@
       <w:r>
         <w:t xml:space="preserve"> </w:t>
       </w:r>
-      <w:hyperlink r:id="rId83">
+      <w:hyperlink ns4:id="rId83">
         <w:r>
           <w:rPr>
             <w:rStyle w:val="Hyperlink"/>
@@ -8877,7 +8871,7 @@
       <w:r>
         <w:t xml:space="preserve"> </w:t>
       </w:r>
-      <w:hyperlink r:id="rId84">
+      <w:hyperlink ns4:id="rId84">
         <w:r>
           <w:rPr>
             <w:rStyle w:val="Hyperlink"/>
@@ -8891,7 +8885,7 @@
       <w:r>
         <w:t xml:space="preserve"> </w:t>
       </w:r>
-      <w:hyperlink r:id="rId85">
+      <w:hyperlink ns4:id="rId85">
         <w:r>
           <w:rPr>
             <w:rStyle w:val="Hyperlink"/>
@@ -8913,7 +8907,7 @@
       <w:r>
         <w:t xml:space="preserve"> </w:t>
       </w:r>
-      <w:hyperlink r:id="rId86">
+      <w:hyperlink ns4:id="rId86">
         <w:r>
           <w:rPr>
             <w:rStyle w:val="Hyperlink"/>
@@ -8935,7 +8929,7 @@
       <w:r>
         <w:t xml:space="preserve"> </w:t>
       </w:r>
-      <w:hyperlink r:id="rId87">
+      <w:hyperlink ns4:id="rId87">
         <w:r>
           <w:rPr>
             <w:rStyle w:val="Hyperlink"/>
@@ -8957,7 +8951,7 @@
       <w:r>
         <w:t xml:space="preserve"> </w:t>
       </w:r>
-      <w:hyperlink r:id="rId88">
+      <w:hyperlink ns4:id="rId88">
         <w:r>
           <w:rPr>
             <w:rStyle w:val="Hyperlink"/>
@@ -8979,7 +8973,7 @@
       <w:r>
         <w:t xml:space="preserve"> </w:t>
       </w:r>
-      <w:hyperlink r:id="rId89">
+      <w:hyperlink ns4:id="rId89">
         <w:r>
           <w:rPr>
             <w:rStyle w:val="Hyperlink"/>
@@ -9001,7 +8995,7 @@
       <w:r>
         <w:t xml:space="preserve"> </w:t>
       </w:r>
-      <w:hyperlink r:id="rId90">
+      <w:hyperlink ns4:id="rId90">
         <w:r>
           <w:rPr>
             <w:rStyle w:val="Hyperlink"/>
@@ -9023,7 +9017,7 @@
       <w:r>
         <w:t xml:space="preserve"> </w:t>
       </w:r>
-      <w:hyperlink r:id="rId91">
+      <w:hyperlink ns4:id="rId91">
         <w:r>
           <w:rPr>
             <w:rStyle w:val="Hyperlink"/>
@@ -9045,7 +9039,7 @@
       <w:r>
         <w:t xml:space="preserve"> </w:t>
       </w:r>
-      <w:hyperlink r:id="rId92">
+      <w:hyperlink ns4:id="rId92">
         <w:r>
           <w:rPr>
             <w:rStyle w:val="Hyperlink"/>
@@ -9067,7 +9061,7 @@
       <w:r>
         <w:t xml:space="preserve"> </w:t>
       </w:r>
-      <w:hyperlink r:id="rId93">
+      <w:hyperlink ns4:id="rId93">
         <w:r>
           <w:rPr>
             <w:rStyle w:val="Hyperlink"/>
@@ -9101,7 +9095,7 @@
       <w:r>
         <w:t xml:space="preserve"> </w:t>
       </w:r>
-      <w:hyperlink r:id="rId94">
+      <w:hyperlink ns4:id="rId94">
         <w:r>
           <w:rPr>
             <w:rStyle w:val="Hyperlink"/>
@@ -9115,7 +9109,7 @@
       <w:r>
         <w:t xml:space="preserve"> </w:t>
       </w:r>
-      <w:hyperlink r:id="rId95">
+      <w:hyperlink ns4:id="rId95">
         <w:r>
           <w:rPr>
             <w:rStyle w:val="Hyperlink"/>
@@ -9137,7 +9131,7 @@
       <w:r>
         <w:t xml:space="preserve"> </w:t>
       </w:r>
-      <w:hyperlink r:id="rId96">
+      <w:hyperlink ns4:id="rId96">
         <w:r>
           <w:rPr>
             <w:rStyle w:val="Hyperlink"/>
@@ -9159,7 +9153,7 @@
       <w:r>
         <w:t xml:space="preserve"> </w:t>
       </w:r>
-      <w:hyperlink r:id="rId97">
+      <w:hyperlink ns4:id="rId97">
         <w:r>
           <w:rPr>
             <w:rStyle w:val="Hyperlink"/>
@@ -9181,7 +9175,7 @@
       <w:r>
         <w:t xml:space="preserve"> </w:t>
       </w:r>
-      <w:hyperlink r:id="rId98">
+      <w:hyperlink ns4:id="rId98">
         <w:r>
           <w:rPr>
             <w:rStyle w:val="Hyperlink"/>

</xml_diff>

<commit_message>
Ignore hallucinated preference IDs
</commit_message>
<xml_diff>
--- a/deliverables/FlatMate-Comfort-NT532-Technical-Report-formatted.docx
+++ b/deliverables/FlatMate-Comfort-NT532-Technical-Report-formatted.docx
@@ -4314,7 +4314,7 @@
         <w:pStyle w:val="BodyText"/>
       </w:pPr>
       <w:r>
-        <w:t xml:space="preserve">Assistant không trực tiếp sửa object Python. set_room_scene chỉ tạo pending scene để backend preview, validate và commit nguyên tử. Sau commit, một lượt LLM không có tool nhận yêu cầu gốc, ChangedValue thật, snapshot mới, context và trạng thái preference để viết toàn bộ phản hồi cuối; câu xác nhận tất định chỉ dùng khi API lỗi hoặc trả rỗng.</w:t>
+        <w:t xml:space="preserve">Assistant không trực tiếp sửa object Python. set_room_scene chỉ tạo pending scene để backend preview, validate và commit nguyên tử. applied_preference_id chỉ là metadata provenance; ID không có hiệu lực bị bỏ thành null, không được đánh dấu đã dùng và không chặn scene hợp lệ. Sau commit, một lượt LLM không có tool nhận yêu cầu gốc, ChangedValue thật, snapshot mới, context và trạng thái preference để viết toàn bộ phản hồi cuối; câu xác nhận tất định chỉ dùng khi API lỗi hoặc trả rỗng.</w:t>
       </w:r>
     </w:p>
     <w:p>
@@ -7677,7 +7677,7 @@
           <w:tcPr/>
           <w:p>
             <w:r>
-              <w:t>71 passed, 1 skipped</w:t>
+              <w:t xml:space="preserve">72 passed, 1 skipped</w:t>
             </w:r>
           </w:p>
         </w:tc>
@@ -7817,7 +7817,7 @@
         <w:pStyle w:val="BodyText"/>
       </w:pPr>
       <w:r>
-        <w:t xml:space="preserve">Test bao phủ contract, scenario loading, deterministic reset, history clamp, atomic command, assistant tool loop, post-commit LLM response không có tool, payload dùng ChangedValue và snapshot đã commit, fallback khi lượt sinh lời cuối lỗi, năm context và chuyển context, explicit-value enforcement, màu đèn tiếng Việt, work/sleep preparation, CO₂ ventilation, user negation, no-op confirmation, trạng thái failed sau scene bị bỏ dở, preference isolation, correction áp dụng ngay, implicit candidate gating và promotion brightness/color sau ba manual override, TTS text normalization, VieNeu/Piper initialization failure cache, Piper WAV contract và giới hạn text runtime.</w:t>
+        <w:t xml:space="preserve">Test bao phủ contract, scenario loading, deterministic reset, history clamp, atomic command, assistant tool loop, post-commit LLM response không có tool, payload dùng ChangedValue và snapshot đã commit, fallback khi lượt sinh lời cuối lỗi, ID preference hallucinated không chặn lệnh tắt toàn bộ, năm context và chuyển context, explicit-value enforcement, màu đèn tiếng Việt, work/sleep preparation, CO₂ ventilation, user negation, no-op confirmation, trạng thái failed sau scene bị bỏ dở, preference isolation, correction áp dụng ngay, implicit candidate gating và promotion brightness/color sau ba manual override, TTS text normalization, VieNeu/Piper initialization failure cache, Piper WAV contract và giới hạn text runtime.</w:t>
       </w:r>
     </w:p>
     <w:bookmarkEnd w:id="69"/>

</xml_diff>

<commit_message>
Make sensor baseline follow realistic daily routine
</commit_message>
<xml_diff>
--- a/deliverables/FlatMate-Comfort-NT532-Technical-Report-formatted.docx
+++ b/deliverables/FlatMate-Comfort-NT532-Technical-Report-formatted.docx
@@ -509,7 +509,7 @@
         <ns0:pStyle ns0:val="BodyText"/>
       </ns0:pPr>
       <ns0:r>
-        <ns0:t>Kết quả kiểm tra tại thời điểm báo cáo gồm 71 test backend đạt, 1 test bỏ qua theo điều kiện môi trường, Ruff đạt, TypeScript đạt, production build và Docker smoke test thành công. Dataset baseline có 1.440 mẫu cảm biến, tương ứng một mẫu mỗi phút trong 24 giờ. Một lần chạy end-to-end trên kịch bản hot_room đã chuyển trạng thái từ AC tắt ở 27°C và quạt tắt sang AC bật ở 25°C, quạt mức 1; cửa sổ giữ đóng. TTS local greedy tạo câu 2,80 giây với thời gian trung bình 2,99 giây; container Piper bị giới hạn đúng 512 MB và 0,1 CPU tạo câu 3,855 giây trong 17,12 giây ở lượt lazy-load đầu, 1,49 giây ở lượt warm và dùng 254,3 MiB RSS cho toàn service.</ns0:t>
+        <ns0:t>Kết quả kiểm tra tại thời điểm báo cáo gồm 75 test backend đạt, 1 test bỏ qua theo điều kiện môi trường, Ruff đạt, TypeScript đạt, production build và Docker smoke test thành công. Dataset baseline có 1.440 mẫu cảm biến, tương ứng một mẫu mỗi phút trong 24 giờ; CO₂ seed 42 dao động 495–1.036 ppm với trung vị 842 ppm và chỉ vượt 1.000 ppm trong 13,5% số mẫu. Một lần chạy end-to-end trên kịch bản hot_room đã chuyển trạng thái từ AC tắt ở 27°C và quạt tắt sang AC bật ở 25°C, quạt mức 1; cửa sổ giữ đóng. TTS local greedy tạo câu 2,80 giây với thời gian trung bình 2,99 giây qua ba lượt; container Piper bị giới hạn đúng 512 MB và 0,1 CPU tạo câu 3,855 giây trong 17,12 giây ở lượt lazy-load đầu, 1,49 giây ở lượt warm và dùng 254,3 MiB RSS cho toàn service.</ns0:t>
       </ns0:r>
       <ns0:r/>
       <ns0:r>
@@ -4025,7 +4025,7 @@
         </ns0:numPr>
       </ns0:pPr>
       <ns0:r>
-        <ns0:t xml:space="preserve">Có người và cửa sổ đóng làm CO₂ tăng.</ns0:t>
+        <ns0:t xml:space="preserve">Lịch ngày gồm ngủ, làm việc tại nhà, thư giãn, hai khoảng vắng nhà và ba khoảng thông gió ngắn; baseline không giả định người dùng ở phòng suốt 24 giờ. CO₂ tiến theo hàm mũ về target riêng cho away, relaxing, working, sleeping và cửa sổ mở; cách tính ổn định khi simulation tăng nhiều phút mỗi tick.</ns0:t>
       </ns0:r>
     </ns0:p>
     <ns0:p>
@@ -4037,7 +4037,7 @@
         </ns0:numPr>
       </ns0:pPr>
       <ns0:r>
-        <ns0:t xml:space="preserve">Cửa sổ mở làm CO₂ giảm nhưng AC phải tắt.</ns0:t>
+        <ns0:t xml:space="preserve">Cửa sổ mở làm CO₂ giảm nhanh nhưng AC phải tắt; PM2.5 đồng thời tiến gần điều kiện ngoài trời.</ns0:t>
       </ns0:r>
     </ns0:p>
     <ns0:p>
@@ -4073,7 +4073,7 @@
         </ns0:numPr>
       </ns0:pPr>
       <ns0:r>
-        <ns0:t xml:space="preserve">Fan, AC và purifier góp phần vào noise level.</ns0:t>
+        <ns0:t xml:space="preserve">Thời điểm, hiện diện, làm việc tại bàn, cửa sổ, fan, AC và purifier góp phần vào noise level.</ns0:t>
       </ns0:r>
     </ns0:p>
     <ns0:p>
@@ -6760,7 +6760,7 @@
         <ns0:t xml:space="preserve">sensor_history.csv</ns0:t>
       </ns0:r>
       <ns0:r>
-        <ns0:t xml:space="preserve">: 1.440 hàng, 19 cột, một mẫu mỗi phút trong 24 giờ.</ns0:t>
+        <ns0:t xml:space="preserve">: 1.440 hàng, 19 cột, một mẫu mỗi phút trong 24 giờ. Seed 42 có CO₂ 495–1.036 ppm, trung vị 842 ppm, vượt 1.000 ppm trong 194/1.440 mẫu; context gồm 525 phút working, 450 phút sleeping, 330 phút relaxing, 135 phút away và cửa sổ mở tổng cộng 65 phút. Kiểm tra runtime tăng tốc ba ngày xác nhận ngày cuối có CO₂ dưới ngưỡng cảnh báo ở hơn một nửa số mẫu.</ns0:t>
       </ns0:r>
     </ns0:p>
     <ns0:p>
@@ -7095,7 +7095,7 @@
               <ns0:jc ns0:val="right"/>
             </ns0:pPr>
             <ns0:r>
-              <ns0:t xml:space="preserve">1.150 ppm</ns0:t>
+              <ns0:t xml:space="preserve">720 ppm</ns0:t>
             </ns0:r>
           </ns0:p>
         </ns0:tc>
@@ -7107,7 +7107,7 @@
               <ns0:jc ns0:val="right"/>
             </ns0:pPr>
             <ns0:r>
-              <ns0:t xml:space="preserve">1.150 ppm</ns0:t>
+              <ns0:t xml:space="preserve">720 ppm</ns0:t>
             </ns0:r>
           </ns0:p>
         </ns0:tc>
@@ -7677,7 +7677,7 @@
           <ns0:tcPr/>
           <ns0:p>
             <ns0:r>
-              <ns0:t xml:space="preserve">73 passed, 1 skipped</ns0:t>
+              <ns0:t xml:space="preserve">75 passed, 1 skipped</ns0:t>
             </ns0:r>
           </ns0:p>
         </ns0:tc>
@@ -7817,7 +7817,7 @@
         <ns0:pStyle ns0:val="BodyText"/>
       </ns0:pPr>
       <ns0:r>
-        <ns0:t xml:space="preserve">Test bao phủ contract, scenario loading, deterministic reset, history clamp, atomic command, assistant tool loop, timeout model mặc định 120 giây, post-commit LLM response không có tool, payload dùng ChangedValue và snapshot đã commit, fallback khi lượt sinh lời cuối lỗi, ID preference hallucinated không chặn lệnh tắt toàn bộ, năm context và chuyển context, explicit-value enforcement, màu đèn tiếng Việt, work/sleep preparation, CO₂ ventilation, user negation, no-op confirmation, trạng thái failed sau scene bị bỏ dở, preference isolation, correction áp dụng ngay, implicit candidate gating và promotion brightness/color sau ba manual override, TTS text normalization, VieNeu/Piper initialization failure cache, Piper WAV contract và giới hạn text runtime.</ns0:t>
+        <ns0:t xml:space="preserve">Test bao phủ contract, scenario loading, deterministic reset, history clamp, atomic command, assistant tool loop, timeout model mặc định 120 giây, phân bố baseline có đủ healthy/high CO₂, away, thông gió, ánh sáng và noise, runtime tăng tốc không khóa CO₂ trên ngưỡng cảnh báo, post-commit LLM response không có tool, payload dùng ChangedValue và snapshot đã commit, fallback khi lượt sinh lời cuối lỗi, ID preference hallucinated không chặn lệnh tắt toàn bộ, năm context và chuyển context, explicit-value enforcement, màu đèn tiếng Việt, work/sleep preparation, CO₂ ventilation, user negation, no-op confirmation, trạng thái failed sau scene bị bỏ dở, preference isolation, correction áp dụng ngay, implicit candidate gating và promotion brightness/color sau ba manual override, TTS text normalization, VieNeu/Piper initialization failure cache, Piper WAV contract và giới hạn text runtime.</ns0:t>
       </ns0:r>
     </ns0:p>
     <ns0:bookmarkEnd ns0:id="69"/>

</xml_diff>